<commit_message>
Align portfolio and resume with frontend-led full stack positioning.
Co-authored-by: Cursor <cursoragent@cursor.com>
</commit_message>
<xml_diff>
--- a/assets/Kiran_Raj_Resume_2026.docx
+++ b/assets/Kiran_Raj_Resume_2026.docx
@@ -8,15 +8,9 @@
         <w:jc w:val="center"/>
       </w:pPr>
       <w:r>
-        <w:rPr>
-          <w:rFonts w:ascii="Arial" w:cs="Arial" w:eastAsia="Arial" w:hAnsi="Arial"/>
-          <w:b/>
-          <w:bCs/>
-          <w:color w:val="1A56A0"/>
-          <w:sz w:val="44"/>
-          <w:szCs w:val="44"/>
-        </w:rPr>
-        <w:t xml:space="preserve">KIRAN RAJ R</w:t>
+        <w:t>KIRAN RAJ</w:t>
+        <w:br/>
+        <w:t>Senior Full Stack Engineer (Frontend-Led) | React.js • Next.js • Node.js | Engineering Lead</w:t>
       </w:r>
     </w:p>
     <w:p>
@@ -130,13 +124,7 @@
         <w:spacing w:after="60" w:before="60"/>
       </w:pPr>
       <w:r>
-        <w:rPr>
-          <w:rFonts w:ascii="Arial" w:cs="Arial" w:eastAsia="Arial" w:hAnsi="Arial"/>
-          <w:color w:val="1A1A1A"/>
-          <w:sz w:val="20"/>
-          <w:szCs w:val="20"/>
-        </w:rPr>
-        <w:t xml:space="preserve">Engineering Lead and Senior Full Stack Engineer with 12+ years of experience building scalable web and mobile applications for fintech, edtech, and e-commerce industries. Specialized in React.js, Next.js, TypeScript, Node.js, and AWS/GCP cloud platforms. Proven track record leading 20+ member engineering teams, architecting micro-frontend systems from scratch, and delivering measurable performance improvements across enterprise B2B/B2C SaaS products. Experience working with UK-based fintech (FT1000 2026 Laureate) and international clients across India, Norway, and the UK. Available with a 15-day notice period. Open to remote, hybrid, and on-site opportunities worldwide.</w:t>
+        <w:t>Senior Full Stack Engineer (Frontend-Led) and Engineering Lead with 12+ years building scalable web and mobile applications for fintech, edtech, and SaaS industries. Deep frontend expertise in React.js, Next.js, and TypeScript, backed by proven full-stack delivery in Node.js, GraphQL, PostgreSQL, and AWS/GCP. Led 20+ member engineering teams, architected micro-frontend systems from scratch, and built end-to-end platforms including PropertyOK and Eduzia. Currently Technical Lead at LoanTube (UK fintech, FT1000 2026 Laureate). Open to Technical Lead, Frontend Architect, and Senior Full Stack Engineer roles worldwide.</w:t>
       </w:r>
     </w:p>
     <w:p>

</xml_diff>

<commit_message>
Remove duplicate headline from resume docx.
Co-authored-by: Cursor <cursoragent@cursor.com>
</commit_message>
<xml_diff>
--- a/assets/Kiran_Raj_Resume_2026.docx
+++ b/assets/Kiran_Raj_Resume_2026.docx
@@ -18,15 +18,7 @@
         <w:spacing w:after="30" w:before="0"/>
         <w:jc w:val="center"/>
       </w:pPr>
-      <w:r>
-        <w:rPr>
-          <w:rFonts w:ascii="Arial" w:cs="Arial" w:eastAsia="Arial" w:hAnsi="Arial"/>
-          <w:color w:val="555555"/>
-          <w:sz w:val="22"/>
-          <w:szCs w:val="22"/>
-        </w:rPr>
-        <w:t xml:space="preserve">Engineering Lead  |  Senior Full Stack Engineer  |  Frontend Architect</w:t>
-      </w:r>
+      <w:r/>
     </w:p>
     <w:p>
       <w:pPr>

</xml_diff>

<commit_message>
Fix Coursera certification year and hardcode stat counters.
Co-authored-by: Cursor <cursoragent@cursor.com>
</commit_message>
<xml_diff>
--- a/assets/Kiran_Raj_Resume_2026.docx
+++ b/assets/Kiran_Raj_Resume_2026.docx
@@ -1789,13 +1789,7 @@
         <w:spacing w:after="30" w:before="30"/>
       </w:pPr>
       <w:r>
-        <w:rPr>
-          <w:rFonts w:ascii="Arial" w:cs="Arial" w:eastAsia="Arial" w:hAnsi="Arial"/>
-          <w:color w:val="1A1A1A"/>
-          <w:sz w:val="20"/>
-          <w:szCs w:val="20"/>
-        </w:rPr>
-        <w:t xml:space="preserve">Meta Front-End Developer Certificate — Coursera (2026)</w:t>
+        <w:t>Meta Front-End Developer Certificate — Coursera (2025)</w:t>
       </w:r>
     </w:p>
     <w:p>

</xml_diff>